<commit_message>
docs: redraw Figure 1 with the code Judge and Policy v2.1 gate, drop the sign-off table, current results in the narration
</commit_message>
<xml_diff>
--- a/docs/RydeResolve_Submission_Draft.docx
+++ b/docs/RydeResolve_Submission_Draft.docx
@@ -22,14 +22,6 @@
           <w:lang w:eastAsia="zh-CN"/>
         </w:rPr>
         <w:t>Project Documentation</w:t>
-      </w:r>
-    </w:p>
-    <w:p>
-      <w:r>
-        <w:rPr>
-          <w:i/>
-        </w:rPr>
-        <w:t>Please review each section and add comments or tracked changes. Sign off in the table at the end.</w:t>
       </w:r>
     </w:p>
     <w:p>
@@ -1483,7 +1475,7 @@
         </w:rPr>
         <w:drawing>
           <wp:inline distT="0" distB="0" distL="0" distR="0" wp14:anchorId="13E87757" wp14:editId="5836F7DB">
-            <wp:extent cx="5760000" cy="6517895"/>
+            <wp:extent cx="4658823" cy="7920000"/>
             <wp:effectExtent l="0" t="0" r="0" b="0"/>
             <wp:docPr id="1" name="Picture 1"/>
             <wp:cNvGraphicFramePr>
@@ -1505,7 +1497,7 @@
                   <pic:spPr>
                     <a:xfrm>
                       <a:off x="0" y="0"/>
-                      <a:ext cx="5760000" cy="6517895"/>
+                      <a:ext cx="4658823" cy="7920000"/>
                     </a:xfrm>
                     <a:prstGeom prst="rect">
                       <a:avLst/>
@@ -1525,7 +1517,7 @@
           <w:color w:val="707070"/>
           <w:sz w:val="19"/>
         </w:rPr>
-        <w:t>Figure 1 — Dispute lifecycle: 7 steps, 2 gates</w:t>
+        <w:t>Figure 1 — Dispute lifecycle: 8 steps, 4 gates (updated 15/10: code Judge and Policy v2.1 gate)</w:t>
       </w:r>
     </w:p>
     <w:p>
@@ -3937,7 +3929,7 @@
         <w:pStyle w:val="ListBullet"/>
       </w:pPr>
       <w:r>
-        <w:t>Figure 2 (docs/architecture.png) updated 2026-10-15: Policy v2.1, the organisers' format, record checks, the policy gate, latest results. Figure 1 (dispute lifecycle) still predates the code Judge.</w:t>
+        <w:t>Figure 2 (docs/architecture.png) updated 2026-10-15: Policy v2.1, the organisers' format, record checks, the policy gate, latest results. Figure 1 (dispute lifecycle) redrawn 2026-10-15 with the code Judge and the Policy v2.1 gate.</w:t>
       </w:r>
     </w:p>
     <w:p>
@@ -3959,201 +3951,6 @@
         <w:t>Still to do: optional 5–8 minute demo video (docs/DEMO_SCRIPT.md, docs/DEMO_NARRATION.md; the organisers' samples are replays demo-6 and demo-7). Cover image (docs/cover) and live demo URL: done.</w:t>
       </w:r>
     </w:p>
-    <w:p>
-      <w:pPr>
-        <w:pStyle w:val="Heading1"/>
-      </w:pPr>
-      <w:r>
-        <w:t>Review and sign-off</w:t>
-      </w:r>
-    </w:p>
-    <w:tbl>
-      <w:tblPr>
-        <w:tblStyle w:val="TableGrid"/>
-        <w:tblW w:w="0" w:type="auto"/>
-        <w:jc w:val="center"/>
-        <w:tblLook w:val="04A0" w:firstRow="1" w:lastRow="0" w:firstColumn="1" w:lastColumn="0" w:noHBand="0" w:noVBand="1"/>
-      </w:tblPr>
-      <w:tblGrid>
-        <w:gridCol w:w="2436"/>
-        <w:gridCol w:w="2436"/>
-        <w:gridCol w:w="2436"/>
-        <w:gridCol w:w="2436"/>
-      </w:tblGrid>
-      <w:tr>
-        <w:trPr>
-          <w:jc w:val="center"/>
-        </w:trPr>
-        <w:tc>
-          <w:tcPr>
-            <w:tcW w:w="2436" w:type="dxa"/>
-            <w:shd w:val="clear" w:color="auto" w:fill="E8EEF7"/>
-          </w:tcPr>
-          <w:p>
-            <w:r>
-              <w:rPr>
-                <w:b/>
-                <w:sz w:val="19"/>
-              </w:rPr>
-              <w:t>Reviewer</w:t>
-            </w:r>
-          </w:p>
-        </w:tc>
-        <w:tc>
-          <w:tcPr>
-            <w:tcW w:w="2436" w:type="dxa"/>
-            <w:shd w:val="clear" w:color="auto" w:fill="E8EEF7"/>
-          </w:tcPr>
-          <w:p>
-            <w:r>
-              <w:rPr>
-                <w:b/>
-                <w:sz w:val="19"/>
-              </w:rPr>
-              <w:t>Sections reviewed</w:t>
-            </w:r>
-          </w:p>
-        </w:tc>
-        <w:tc>
-          <w:tcPr>
-            <w:tcW w:w="2436" w:type="dxa"/>
-            <w:shd w:val="clear" w:color="auto" w:fill="E8EEF7"/>
-          </w:tcPr>
-          <w:p>
-            <w:r>
-              <w:rPr>
-                <w:b/>
-                <w:sz w:val="19"/>
-              </w:rPr>
-              <w:t>Approved? (Yes / Changes needed)</w:t>
-            </w:r>
-          </w:p>
-        </w:tc>
-        <w:tc>
-          <w:tcPr>
-            <w:tcW w:w="2436" w:type="dxa"/>
-            <w:shd w:val="clear" w:color="auto" w:fill="E8EEF7"/>
-          </w:tcPr>
-          <w:p>
-            <w:r>
-              <w:rPr>
-                <w:b/>
-                <w:sz w:val="19"/>
-              </w:rPr>
-              <w:t>Comments</w:t>
-            </w:r>
-          </w:p>
-        </w:tc>
-      </w:tr>
-      <w:tr>
-        <w:trPr>
-          <w:jc w:val="center"/>
-        </w:trPr>
-        <w:tc>
-          <w:tcPr>
-            <w:tcW w:w="2436" w:type="dxa"/>
-          </w:tcPr>
-          <w:p>
-            <w:r>
-              <w:rPr>
-                <w:sz w:val="19"/>
-              </w:rPr>
-              <w:t>Chen FengFan</w:t>
-            </w:r>
-          </w:p>
-        </w:tc>
-        <w:tc>
-          <w:tcPr>
-            <w:tcW w:w="2436" w:type="dxa"/>
-          </w:tcPr>
-          <w:p/>
-        </w:tc>
-        <w:tc>
-          <w:tcPr>
-            <w:tcW w:w="2436" w:type="dxa"/>
-          </w:tcPr>
-          <w:p/>
-        </w:tc>
-        <w:tc>
-          <w:tcPr>
-            <w:tcW w:w="2436" w:type="dxa"/>
-          </w:tcPr>
-          <w:p/>
-        </w:tc>
-      </w:tr>
-      <w:tr>
-        <w:trPr>
-          <w:jc w:val="center"/>
-        </w:trPr>
-        <w:tc>
-          <w:tcPr>
-            <w:tcW w:w="2436" w:type="dxa"/>
-          </w:tcPr>
-          <w:p>
-            <w:r>
-              <w:rPr>
-                <w:sz w:val="19"/>
-              </w:rPr>
-              <w:t>Zhilin</w:t>
-            </w:r>
-          </w:p>
-        </w:tc>
-        <w:tc>
-          <w:tcPr>
-            <w:tcW w:w="2436" w:type="dxa"/>
-          </w:tcPr>
-          <w:p/>
-        </w:tc>
-        <w:tc>
-          <w:tcPr>
-            <w:tcW w:w="2436" w:type="dxa"/>
-          </w:tcPr>
-          <w:p/>
-        </w:tc>
-        <w:tc>
-          <w:tcPr>
-            <w:tcW w:w="2436" w:type="dxa"/>
-          </w:tcPr>
-          <w:p/>
-        </w:tc>
-      </w:tr>
-      <w:tr>
-        <w:trPr>
-          <w:jc w:val="center"/>
-        </w:trPr>
-        <w:tc>
-          <w:tcPr>
-            <w:tcW w:w="2436" w:type="dxa"/>
-          </w:tcPr>
-          <w:p>
-            <w:r>
-              <w:rPr>
-                <w:sz w:val="19"/>
-              </w:rPr>
-              <w:t>Yang Shuo</w:t>
-            </w:r>
-          </w:p>
-        </w:tc>
-        <w:tc>
-          <w:tcPr>
-            <w:tcW w:w="2436" w:type="dxa"/>
-          </w:tcPr>
-          <w:p/>
-        </w:tc>
-        <w:tc>
-          <w:tcPr>
-            <w:tcW w:w="2436" w:type="dxa"/>
-          </w:tcPr>
-          <w:p/>
-        </w:tc>
-        <w:tc>
-          <w:tcPr>
-            <w:tcW w:w="2436" w:type="dxa"/>
-          </w:tcPr>
-          <w:p/>
-        </w:tc>
-      </w:tr>
-    </w:tbl>
     <w:p/>
     <w:sectPr>
       <w:pgSz w:w="12240" w:h="15840"/>

</xml_diff>

<commit_message>
D51: precedents chosen by type, policy and principle; Judge-only model and self-hosted provider; notices in four languages; data protection and cost in the docs
</commit_message>
<xml_diff>
--- a/docs/RydeResolve_Submission_Draft.docx
+++ b/docs/RydeResolve_Submission_Draft.docx
@@ -2580,6 +2580,66 @@
     </w:p>
     <w:p>
       <w:pPr>
+        <w:pStyle w:val="ListBullet"/>
+      </w:pPr>
+      <w:r>
+        <w:rPr>
+          <w:b/>
+        </w:rPr>
+        <w:t>Data protection</w:t>
+      </w:r>
+      <w:r>
+        <w:rPr/>
+        <w:t xml:space="preserve"> — each agent sees only what its role needs (advocates never see fraud scores or dispute history); prompts forbid inferring protected characteristics and repeating unneeded personal data; the demo uses only synthetic data and the organisers' samples; the demo access code cannot read rulings, precedents, people or the audit log.</w:t>
+      </w:r>
+    </w:p>
+    <w:p>
+      <w:pPr>
+        <w:pStyle w:val="ListBullet"/>
+      </w:pPr>
+      <w:r>
+        <w:rPr>
+          <w:b/>
+        </w:rPr>
+        <w:t>Notices both parties can read</w:t>
+      </w:r>
+      <w:r>
+        <w:rPr/>
+        <w:t xml:space="preserve"> — each party's notice is built by code from the ruling's fields only, so it cannot state an amount the ruling did not make, and the dashboard shows it in English, Chinese, Malay or Tamil without another model call.</w:t>
+      </w:r>
+    </w:p>
+    <w:p>
+      <w:pPr>
+        <w:pStyle w:val="ListBullet"/>
+      </w:pPr>
+      <w:r>
+        <w:rPr>
+          <w:b/>
+        </w:rPr>
+        <w:t>Precedents chosen by code</w:t>
+      </w:r>
+      <w:r>
+        <w:rPr/>
+        <w:t xml:space="preserve"> — a human-corrected ruling becomes a precedent only after an evaluation shows it does no harm; the Judge sees at most three, of the same dispute type, decided under the policy now in force, one per principle, most similar facts first, and a ruling can only claim a precedent it was shown.</w:t>
+      </w:r>
+    </w:p>
+    <w:p>
+      <w:pPr>
+        <w:pStyle w:val="ListBullet"/>
+      </w:pPr>
+      <w:r>
+        <w:rPr>
+          <w:b/>
+        </w:rPr>
+        <w:t>For a real deployment under the PDPA (not built)</w:t>
+      </w:r>
+      <w:r>
+        <w:rPr/>
+        <w:t xml:space="preserve"> — tell riders and drivers that AI takes part and how to ask for a person; mask names, phone and plate numbers before any external model call or keep the model in-house; delete chats, photos and GPS traces after the appeal window; encrypt at rest; providers under a data-processing agreement with no training on the data; an "ask a person to review" link in every notice.</w:t>
+      </w:r>
+    </w:p>
+    <w:p>
+      <w:pPr>
         <w:pStyle w:val="Heading1"/>
       </w:pPr>
       <w:r>
@@ -3860,7 +3920,7 @@
       </w:pPr>
       <w:r>
         <w:rPr/>
-        <w:t>Cost — about 29,000 tokens per dispute, roughly US$0.01–0.02 at Cerebras list prices for gpt-oss-120b (US$0.35 in / US$0.75 out per million tokens).</w:t>
+        <w:t>Cost today — per dispute the Judge uses about 9,000 tokens in and 1,600 out, and the six other calls together about 24,000 in and 6,000 out: about US$0.017 a dispute on gpt-oss-120b at Cerebras list prices (US$0.35 in / US$0.75 out per million tokens).</w:t>
       </w:r>
     </w:p>
     <w:p>
@@ -3869,7 +3929,16 @@
       </w:pPr>
       <w:r>
         <w:rPr/>
-        <w:t>Scale (illustration, not a Ryde figure) — at 1,000 disputes a day, closing 78% of the AI-decidable ones automatically removes the manual first read from most tickets; the rest reach a person with the case built.</w:t>
+        <w:t>Scale (illustration, not a Ryde figure) — at 1,000 disputes a day: about US$520 a month with every agent on gpt-oss-120b; about US$1,400–2,100 with the Judge on Claude Sonnet 5.5 (US$2 / US$10) and the rest on gpt-oss-120b; about US$2,400–3,900 with the Judge on Claude Opus 5.5 (US$4 / US$20). At 5,000 a day, five times that. Photo cases add a vision call per photo; servers are extra. Closing 78% of the AI-decidable disputes automatically removes the manual first read from most tickets; the rest reach a person with the case already built.</w:t>
+      </w:r>
+    </w:p>
+    <w:p>
+      <w:pPr>
+        <w:pStyle w:val="ListBullet"/>
+      </w:pPr>
+      <w:r>
+        <w:rPr/>
+        <w:t>Production setup — the live site is a demo on one 2 vCPU / 2 GB Tencent Lighthouse server. A real deployment adds Tencent Cloud instances behind a load balancer, Postgres and a job queue; a case mostly waits on the model, so throughput is set by the provider's rate limits, not CPU. JUDGE_LLM_PROVIDER gives the Judge a stronger model while the other agents stay on gpt-oss-120b. An open model such as DeepSeek on the company's own GPU server (LLM_PROVIDER=openai_compatible, served with vLLM or Ollama) has no per-token fee and keeps the data in-house. Every accuracy figure here is for gpt-oss-120b: a model change is re-evaluated on the same sets before it goes live.</w:t>
       </w:r>
     </w:p>
     <w:p>

</xml_diff>